<commit_message>
Add project status + how-it-works README; sync Design dock.docx with latest .md
</commit_message>
<xml_diff>
--- a/Design dock.docx
+++ b/Design dock.docx
@@ -5,23 +5,21 @@
     <w:p>
       <w:pPr>
         <w:pStyle w:val="Title"/>
+        <w:jc w:val="left"/>
       </w:pPr>
       <w:r>
         <w:t>InternMatch AI — Design Document</w:t>
       </w:r>
     </w:p>
     <w:p>
-      <w:r/>
       <w:r>
         <w:rPr>
           <w:b/>
         </w:rPr>
         <w:t>MongoDB Hackathon · Team of 4</w:t>
       </w:r>
-      <w:r/>
     </w:p>
     <w:p>
-      <w:r/>
       <w:r>
         <w:rPr>
           <w:b/>
@@ -33,7 +31,6 @@
       </w:r>
     </w:p>
     <w:p>
-      <w:r/>
       <w:r>
         <w:rPr>
           <w:b/>
@@ -62,7 +59,25 @@
         <w:pStyle w:val="ListBullet"/>
       </w:pPr>
       <w:r>
-        <w:t>Job search is keyword-based, not meaning-based. A "built a React dashboard with a Postgres backend" project won't surface a "Backend Engineering Intern — SQL" role, even though it's a great fit.</w:t>
+        <w:t xml:space="preserve">Job search is </w:t>
+      </w:r>
+      <w:r>
+        <w:rPr>
+          <w:b/>
+        </w:rPr>
+        <w:t>keyword-based</w:t>
+      </w:r>
+      <w:r>
+        <w:t xml:space="preserve">, not </w:t>
+      </w:r>
+      <w:r>
+        <w:rPr>
+          <w:b/>
+        </w:rPr>
+        <w:t>meaning-based</w:t>
+      </w:r>
+      <w:r>
+        <w:t>. A CV describing "built a React dashboard with a Postgres backend" won't surface a "Backend Engineering Intern — SQL" role, even though it's a great fit.</w:t>
       </w:r>
     </w:p>
     <w:p>
@@ -70,7 +85,7 @@
         <w:pStyle w:val="ListBullet"/>
       </w:pPr>
       <w:r>
-        <w:t>Students don't know how to translate messy project descriptions / CVs into the language recruiters use.</w:t>
+        <w:t>Students apply manually to dozens of roles with no idea which actually fit.</w:t>
       </w:r>
     </w:p>
     <w:p>
@@ -78,11 +93,10 @@
         <w:pStyle w:val="ListBullet"/>
       </w:pPr>
       <w:r>
-        <w:t>Non-obvious matches (transferable skills) are invisible.</w:t>
+        <w:t>Recruiters drown in irrelevant applications.</w:t>
       </w:r>
     </w:p>
     <w:p>
-      <w:r/>
       <w:r>
         <w:rPr>
           <w:b/>
@@ -90,7 +104,34 @@
         <w:t>InternMatch AI</w:t>
       </w:r>
       <w:r>
-        <w:t xml:space="preserve"> solves this with semantic (vector) search over internship listings, plus an AI agent that reads a student's GitHub repo and auto-generates a profile to search with.</w:t>
+        <w:t xml:space="preserve"> flips this: a student uploads their </w:t>
+      </w:r>
+      <w:r>
+        <w:rPr>
+          <w:b/>
+        </w:rPr>
+        <w:t>CV once</w:t>
+      </w:r>
+      <w:r>
+        <w:t xml:space="preserve"> (plus their email), the app semantically matches it against all stored job descriptions, and </w:t>
+      </w:r>
+      <w:r>
+        <w:rPr>
+          <w:b/>
+        </w:rPr>
+        <w:t>automatically emails the student</w:t>
+      </w:r>
+      <w:r>
+        <w:t xml:space="preserve"> about every strong match. Each email states that job's </w:t>
+      </w:r>
+      <w:r>
+        <w:rPr>
+          <w:b/>
+        </w:rPr>
+        <w:t>predefined next step</w:t>
+      </w:r>
+      <w:r>
+        <w:t xml:space="preserve"> (e.g. a Zoom call or assessment), which the recruiter sets upfront when the job is posted.</w:t>
       </w:r>
     </w:p>
     <w:p>
@@ -114,7 +155,7 @@
         <w:pStyle w:val="ListBullet"/>
       </w:pPr>
       <w:r>
-        <w:t>Paste a CV / project description → get semantically ranked internship matches.</w:t>
+        <w:t>Upload a CV (PDF/DOCX) + enter email → parse → semantic match against job descriptions.</w:t>
       </w:r>
     </w:p>
     <w:p>
@@ -122,7 +163,16 @@
         <w:pStyle w:val="ListBullet"/>
       </w:pPr>
       <w:r>
-        <w:t>Surface non-obvious matches (transferable skills), with an explanation of *why* each matched.</w:t>
+        <w:t xml:space="preserve">Return </w:t>
+      </w:r>
+      <w:r>
+        <w:rPr>
+          <w:b/>
+        </w:rPr>
+        <w:t>all</w:t>
+      </w:r>
+      <w:r>
+        <w:t xml:space="preserve"> strong matches above a similarity threshold (not just the top one).</w:t>
       </w:r>
     </w:p>
     <w:p>
@@ -130,7 +180,34 @@
         <w:pStyle w:val="ListBullet"/>
       </w:pPr>
       <w:r>
-        <w:t>Agentic path: give a GitHub repo URL → agent analyzes code → generates a searchable profile automatically.</w:t>
+        <w:t xml:space="preserve">For </w:t>
+      </w:r>
+      <w:r>
+        <w:rPr>
+          <w:b/>
+        </w:rPr>
+        <w:t>each</w:t>
+      </w:r>
+      <w:r>
+        <w:t xml:space="preserve"> strong match, send the student </w:t>
+      </w:r>
+      <w:r>
+        <w:rPr>
+          <w:b/>
+        </w:rPr>
+        <w:t>one email</w:t>
+      </w:r>
+      <w:r>
+        <w:t xml:space="preserve"> naming the role and its </w:t>
+      </w:r>
+      <w:r>
+        <w:rPr>
+          <w:b/>
+        </w:rPr>
+        <w:t>predefined next step</w:t>
+      </w:r>
+      <w:r>
+        <w:t>.</w:t>
       </w:r>
     </w:p>
     <w:p>
@@ -138,7 +215,16 @@
         <w:pStyle w:val="ListBullet"/>
       </w:pPr>
       <w:r>
-        <w:t>Clean, fast demo that shows a full AI-native workflow end to end.</w:t>
+        <w:t xml:space="preserve">The next step is a field on each job, </w:t>
+      </w:r>
+      <w:r>
+        <w:rPr>
+          <w:b/>
+        </w:rPr>
+        <w:t>decided upfront when the job is posted</w:t>
+      </w:r>
+      <w:r>
+        <w:t xml:space="preserve"> (not AI-generated).</w:t>
       </w:r>
     </w:p>
     <w:p>
@@ -154,7 +240,13 @@
         <w:pStyle w:val="ListBullet"/>
       </w:pPr>
       <w:r>
-        <w:t>Real-time scraping of live job boards (we pre-ingest a fixed dataset).</w:t>
+        <w:rPr>
+          <w:b/>
+        </w:rPr>
+        <w:t>No scraping of any kind.</w:t>
+      </w:r>
+      <w:r>
+        <w:t xml:space="preserve"> Job descriptions are pre-seeded directly into MongoDB from a committed dataset. The app only matches CV text against those stored listings.</w:t>
       </w:r>
     </w:p>
     <w:p>
@@ -162,7 +254,7 @@
         <w:pStyle w:val="ListBullet"/>
       </w:pPr>
       <w:r>
-        <w:t>User accounts / auth / saved searches.</w:t>
+        <w:t>User accounts / login / recruiter dashboard.</w:t>
       </w:r>
     </w:p>
     <w:p>
@@ -170,7 +262,7 @@
         <w:pStyle w:val="ListBullet"/>
       </w:pPr>
       <w:r>
-        <w:t>Applying to jobs or messaging recruiters.</w:t>
+        <w:t>Generating or grading assessments (the next step is just stated; recruiter handles it).</w:t>
       </w:r>
     </w:p>
     <w:p>
@@ -178,7 +270,7 @@
         <w:pStyle w:val="ListBullet"/>
       </w:pPr>
       <w:r>
-        <w:t>Production-grade scaling. ~200–500 listings is enough for the demo.</w:t>
+        <w:t>GitHub repo analysis (removed from scope).</w:t>
       </w:r>
     </w:p>
     <w:p>
@@ -201,45 +293,139 @@
         <w:br/>
         <w:t>│ (Vite)      │◀────│   (Python)              │◀────│  + Vector Search     │</w:t>
         <w:br/>
+        <w:t>│ upload CV   │     │                         │     │  (job descriptions)  │</w:t>
+        <w:br/>
+        <w:t>│ + email     │     │                         │     │                      │</w:t>
+        <w:br/>
         <w:t>└─────────────┘     └───────────┬────────────┘     └──────────────────────┘</w:t>
         <w:br/>
         <w:t xml:space="preserve">                                │</w:t>
         <w:br/>
-        <w:t xml:space="preserve">                 ┌──────────────┼───────────────┐</w:t>
+        <w:t xml:space="preserve">                 ┌──────────────┼────────────────┐</w:t>
         <w:br/>
-        <w:t xml:space="preserve">                 ▼              ▼                ▼</w:t>
+        <w:t xml:space="preserve">                 ▼              ▼                 ▼</w:t>
         <w:br/>
-        <w:t xml:space="preserve">          ┌───────────┐  ┌────────────┐  ┌──────────────┐</w:t>
+        <w:t xml:space="preserve">          ┌───────────┐  ┌────────────┐   ┌──────────────┐</w:t>
         <w:br/>
-        <w:t xml:space="preserve">          │ Voyage AI │  │ Claude     │  │ GitHub API   │</w:t>
+        <w:t xml:space="preserve">          │ CV parser │  │ Voyage AI  │   │ Gmail SMTP   │</w:t>
         <w:br/>
-        <w:t xml:space="preserve">          │ embeddings│  │ (agent LLM)│  │ (repo fetch) │</w:t>
+        <w:t xml:space="preserve">          │ pdf/docx  │  │ embeddings │   │ (one email   │</w:t>
         <w:br/>
-        <w:t xml:space="preserve">          └───────────┘  └────────────┘  └──────────────┘</w:t>
+        <w:t xml:space="preserve">          │ → text    │  │            │   │  per match)  │</w:t>
+        <w:br/>
+        <w:t xml:space="preserve">          └───────────┘  └────────────┘   └──────────────┘</w:t>
       </w:r>
     </w:p>
     <w:p>
-      <w:r/>
       <w:r>
         <w:rPr>
           <w:b/>
         </w:rPr>
-        <w:t>Flow A — Direct search:</w:t>
-      </w:r>
-      <w:r>
-        <w:t xml:space="preserve"> User pastes text → backend embeds it with Voyage AI → Atlas $vectorSearch → ranked listings → Claude generates a one-line "why this matched" per result.</w:t>
+        <w:t>End-to-end flow:</w:t>
       </w:r>
     </w:p>
     <w:p>
-      <w:r/>
+      <w:pPr>
+        <w:pStyle w:val="ListNumber"/>
+      </w:pPr>
+      <w:r>
+        <w:t>User uploads CV file + enters their email in the React UI.</w:t>
+      </w:r>
+    </w:p>
+    <w:p>
+      <w:pPr>
+        <w:pStyle w:val="ListNumber"/>
+      </w:pPr>
+      <w:r>
+        <w:t>Backend extracts text from the CV (pdfplumber / python-docx).</w:t>
+      </w:r>
+    </w:p>
+    <w:p>
+      <w:pPr>
+        <w:pStyle w:val="ListNumber"/>
+      </w:pPr>
+      <w:r>
+        <w:t>Backend embeds the CV text with Voyage AI (</w:t>
+      </w:r>
+      <w:r>
+        <w:rPr>
+          <w:rFonts w:ascii="Consolas" w:hAnsi="Consolas"/>
+          <w:color w:val="C7254E"/>
+        </w:rPr>
+        <w:t>voyage-3</w:t>
+      </w:r>
+      <w:r>
+        <w:t>, 1024 dims).</w:t>
+      </w:r>
+    </w:p>
+    <w:p>
+      <w:pPr>
+        <w:pStyle w:val="ListNumber"/>
+      </w:pPr>
+      <w:r>
+        <w:t xml:space="preserve">Atlas </w:t>
+      </w:r>
+      <w:r>
+        <w:rPr>
+          <w:rFonts w:ascii="Consolas" w:hAnsi="Consolas"/>
+          <w:color w:val="C7254E"/>
+        </w:rPr>
+        <w:t>$vectorSearch</w:t>
+      </w:r>
+      <w:r>
+        <w:t xml:space="preserve"> ranks job descriptions; keep all with </w:t>
+      </w:r>
+      <w:r>
+        <w:rPr>
+          <w:rFonts w:ascii="Consolas" w:hAnsi="Consolas"/>
+          <w:color w:val="C7254E"/>
+        </w:rPr>
+        <w:t>score &gt;= THRESHOLD</w:t>
+      </w:r>
+      <w:r>
+        <w:t>.</w:t>
+      </w:r>
+    </w:p>
+    <w:p>
+      <w:pPr>
+        <w:pStyle w:val="ListNumber"/>
+      </w:pPr>
+      <w:r>
+        <w:t xml:space="preserve">For each strong match, send the student </w:t>
+      </w:r>
       <w:r>
         <w:rPr>
           <w:b/>
         </w:rPr>
-        <w:t>Flow B — Agentic:</w:t>
+        <w:t>one email</w:t>
       </w:r>
       <w:r>
-        <w:t xml:space="preserve"> User submits GitHub URL → backend fetches repo (README + file tree + key files) → Claude analyzes and produces a structured profile (skills, strengths, suggested roles) → that profile text feeds Flow A.</w:t>
+        <w:t xml:space="preserve"> via Gmail SMTP, stating the role and that job's </w:t>
+      </w:r>
+      <w:r>
+        <w:rPr>
+          <w:b/>
+        </w:rPr>
+        <w:t>`next_step`</w:t>
+      </w:r>
+      <w:r>
+        <w:t>.</w:t>
+      </w:r>
+    </w:p>
+    <w:p>
+      <w:pPr>
+        <w:pStyle w:val="ListNumber"/>
+      </w:pPr>
+      <w:r>
+        <w:t>UI confirms which jobs were matched and emailed.</w:t>
+      </w:r>
+    </w:p>
+    <w:p>
+      <w:pPr>
+        <w:pStyle w:val="ListNumber"/>
+      </w:pPr>
+      <w:r>
+        <w:t>The recruiter runs the stated next step (Zoom call / assessment / etc.) — outside the app.</w:t>
       </w:r>
     </w:p>
     <w:p>
@@ -252,7 +438,7 @@
     </w:p>
     <w:tbl>
       <w:tblPr>
-        <w:tblStyle w:val="LightGrid-Accent1"/>
+        <w:tblStyle w:val="TableGrid"/>
         <w:tblW w:type="auto" w:w="0"/>
         <w:tblLook w:firstColumn="1" w:firstRow="1" w:lastColumn="0" w:lastRow="0" w:noHBand="0" w:noVBand="1" w:val="04A0"/>
       </w:tblPr>
@@ -268,6 +454,14 @@
           </w:tcPr>
           <w:p>
             <w:r>
+              <w:rPr>
+                <w:b/>
+              </w:rPr>
+            </w:r>
+            <w:r>
+              <w:rPr>
+                <w:b/>
+              </w:rPr>
               <w:t>Layer</w:t>
             </w:r>
           </w:p>
@@ -278,6 +472,14 @@
           </w:tcPr>
           <w:p>
             <w:r>
+              <w:rPr>
+                <w:b/>
+              </w:rPr>
+            </w:r>
+            <w:r>
+              <w:rPr>
+                <w:b/>
+              </w:rPr>
               <w:t>Choice</w:t>
             </w:r>
           </w:p>
@@ -288,6 +490,14 @@
           </w:tcPr>
           <w:p>
             <w:r>
+              <w:rPr>
+                <w:b/>
+              </w:rPr>
+            </w:r>
+            <w:r>
+              <w:rPr>
+                <w:b/>
+              </w:rPr>
               <w:t>Why</w:t>
             </w:r>
           </w:p>
@@ -299,6 +509,7 @@
             <w:tcW w:type="dxa" w:w="2880"/>
           </w:tcPr>
           <w:p>
+            <w:r/>
             <w:r>
               <w:t>Frontend</w:t>
             </w:r>
@@ -309,6 +520,7 @@
             <w:tcW w:type="dxa" w:w="2880"/>
           </w:tcPr>
           <w:p>
+            <w:r/>
             <w:r>
               <w:t>React + Vite + Tailwind</w:t>
             </w:r>
@@ -319,8 +531,9 @@
             <w:tcW w:type="dxa" w:w="2880"/>
           </w:tcPr>
           <w:p>
+            <w:r/>
             <w:r>
-              <w:t>Fast dev, clean demo UI</w:t>
+              <w:t>Fast dev, clean demo UI, file upload</w:t>
             </w:r>
           </w:p>
         </w:tc>
@@ -331,6 +544,7 @@
             <w:tcW w:type="dxa" w:w="2880"/>
           </w:tcPr>
           <w:p>
+            <w:r/>
             <w:r>
               <w:t>Backend</w:t>
             </w:r>
@@ -341,6 +555,7 @@
             <w:tcW w:type="dxa" w:w="2880"/>
           </w:tcPr>
           <w:p>
+            <w:r/>
             <w:r>
               <w:t>Python + FastAPI</w:t>
             </w:r>
@@ -351,8 +566,9 @@
             <w:tcW w:type="dxa" w:w="2880"/>
           </w:tcPr>
           <w:p>
+            <w:r/>
             <w:r>
-              <w:t>Great for embeddings/scraping; async</w:t>
+              <w:t>Great for parsing/embeddings; async</w:t>
             </w:r>
           </w:p>
         </w:tc>
@@ -363,6 +579,7 @@
             <w:tcW w:type="dxa" w:w="2880"/>
           </w:tcPr>
           <w:p>
+            <w:r/>
             <w:r>
               <w:t>Database</w:t>
             </w:r>
@@ -373,6 +590,7 @@
             <w:tcW w:type="dxa" w:w="2880"/>
           </w:tcPr>
           <w:p>
+            <w:r/>
             <w:r>
               <w:t>MongoDB Atlas (M0 free tier)</w:t>
             </w:r>
@@ -383,6 +601,7 @@
             <w:tcW w:type="dxa" w:w="2880"/>
           </w:tcPr>
           <w:p>
+            <w:r/>
             <w:r>
               <w:t>Required; native Vector Search</w:t>
             </w:r>
@@ -395,6 +614,7 @@
             <w:tcW w:type="dxa" w:w="2880"/>
           </w:tcPr>
           <w:p>
+            <w:r/>
             <w:r>
               <w:t>Embeddings</w:t>
             </w:r>
@@ -405,8 +625,25 @@
             <w:tcW w:type="dxa" w:w="2880"/>
           </w:tcPr>
           <w:p>
+            <w:r/>
             <w:r>
-              <w:t>Voyage AI (voyage-3)</w:t>
+              <w:rPr>
+                <w:b/>
+              </w:rPr>
+              <w:t>Voyage AI</w:t>
+            </w:r>
+            <w:r>
+              <w:t xml:space="preserve"> (</w:t>
+            </w:r>
+            <w:r>
+              <w:rPr>
+                <w:rFonts w:ascii="Consolas" w:hAnsi="Consolas"/>
+                <w:color w:val="C7254E"/>
+              </w:rPr>
+              <w:t>voyage-3</w:t>
+            </w:r>
+            <w:r>
+              <w:t>, 1024 dims)</w:t>
             </w:r>
           </w:p>
         </w:tc>
@@ -415,6 +652,7 @@
             <w:tcW w:type="dxa" w:w="2880"/>
           </w:tcPr>
           <w:p>
+            <w:r/>
             <w:r>
               <w:t>MongoDB's partner; judges favor it</w:t>
             </w:r>
@@ -427,8 +665,9 @@
             <w:tcW w:type="dxa" w:w="2880"/>
           </w:tcPr>
           <w:p>
+            <w:r/>
             <w:r>
-              <w:t>Agent LLM</w:t>
+              <w:t>CV parsing</w:t>
             </w:r>
           </w:p>
         </w:tc>
@@ -437,8 +676,9 @@
             <w:tcW w:type="dxa" w:w="2880"/>
           </w:tcPr>
           <w:p>
+            <w:r/>
             <w:r>
-              <w:t>Claude (claude-sonnet-4-6 / claude-haiku-4-5)</w:t>
+              <w:t>pdfplumber + python-docx</w:t>
             </w:r>
           </w:p>
         </w:tc>
@@ -447,8 +687,9 @@
             <w:tcW w:type="dxa" w:w="2880"/>
           </w:tcPr>
           <w:p>
+            <w:r/>
             <w:r>
-              <w:t>Strong code understanding</w:t>
+              <w:t>Plain text extraction from PDF/DOCX</w:t>
             </w:r>
           </w:p>
         </w:tc>
@@ -459,8 +700,9 @@
             <w:tcW w:type="dxa" w:w="2880"/>
           </w:tcPr>
           <w:p>
+            <w:r/>
             <w:r>
-              <w:t>Repo fetch</w:t>
+              <w:t>Match reasons (optional)</w:t>
             </w:r>
           </w:p>
         </w:tc>
@@ -469,8 +711,25 @@
             <w:tcW w:type="dxa" w:w="2880"/>
           </w:tcPr>
           <w:p>
+            <w:r/>
             <w:r>
-              <w:t>GitHub REST API</w:t>
+              <w:rPr>
+                <w:b/>
+              </w:rPr>
+              <w:t>Claude</w:t>
+            </w:r>
+            <w:r>
+              <w:t xml:space="preserve"> (</w:t>
+            </w:r>
+            <w:r>
+              <w:rPr>
+                <w:rFonts w:ascii="Consolas" w:hAnsi="Consolas"/>
+                <w:color w:val="C7254E"/>
+              </w:rPr>
+              <w:t>claude-haiku-4-5</w:t>
+            </w:r>
+            <w:r>
+              <w:t>)</w:t>
             </w:r>
           </w:p>
         </w:tc>
@@ -479,8 +738,9 @@
             <w:tcW w:type="dxa" w:w="2880"/>
           </w:tcPr>
           <w:p>
+            <w:r/>
             <w:r>
-              <w:t>Pull README + tree + key source files</w:t>
+              <w:t>One-line "why matched" per result</w:t>
             </w:r>
           </w:p>
         </w:tc>
@@ -491,8 +751,9 @@
             <w:tcW w:type="dxa" w:w="2880"/>
           </w:tcPr>
           <w:p>
+            <w:r/>
             <w:r>
-              <w:t>Agent infra (optional)</w:t>
+              <w:t>Email</w:t>
             </w:r>
           </w:p>
         </w:tc>
@@ -501,8 +762,15 @@
             <w:tcW w:type="dxa" w:w="2880"/>
           </w:tcPr>
           <w:p>
+            <w:r/>
             <w:r>
-              <w:t>Hoplite cloud agent</w:t>
+              <w:rPr>
+                <w:b/>
+              </w:rPr>
+              <w:t>Gmail SMTP</w:t>
+            </w:r>
+            <w:r>
+              <w:t xml:space="preserve"> (smtplib + app password)</w:t>
             </w:r>
           </w:p>
         </w:tc>
@@ -511,13 +779,15 @@
             <w:tcW w:type="dxa" w:w="2880"/>
           </w:tcPr>
           <w:p>
+            <w:r/>
             <w:r>
-              <w:t>Shows AI-native workflow in demo</w:t>
+              <w:t>Zero signup, works instantly</w:t>
             </w:r>
           </w:p>
         </w:tc>
       </w:tr>
     </w:tbl>
+    <w:p/>
     <w:p>
       <w:pPr>
         <w:pStyle w:val="Heading1"/>
@@ -531,7 +801,7 @@
         <w:pStyle w:val="Heading2"/>
       </w:pPr>
       <w:r>
-        <w:t>Collection: `listings`</w:t>
+        <w:t>Collection: `listings` (job descriptions)</w:t>
       </w:r>
     </w:p>
     <w:p>
@@ -556,11 +826,74 @@
         <w:br/>
         <w:t xml:space="preserve">  "skills": ["Python", "SQL", "REST APIs"],</w:t>
         <w:br/>
+        <w:t xml:space="preserve">  "next_step": "Recruiter will schedule a 30-minute Zoom intro call.",</w:t>
+        <w:br/>
         <w:t xml:space="preserve">  "source": "IrishJobs.ie",</w:t>
         <w:br/>
         <w:t xml:space="preserve">  "embedding": [0.013, -0.021, ...],   // 1024-dim Voyage vector</w:t>
         <w:br/>
         <w:t xml:space="preserve">  "ingested_at": "2026-10-03T10:00:00Z"</w:t>
+        <w:br/>
+        <w:t>}</w:t>
+      </w:r>
+    </w:p>
+    <w:p>
+      <w:pPr>
+        <w:pStyle w:val="IntenseQuote"/>
+      </w:pPr>
+      <w:r>
+        <w:rPr>
+          <w:rFonts w:ascii="Consolas" w:hAnsi="Consolas"/>
+          <w:color w:val="C7254E"/>
+        </w:rPr>
+        <w:t>next_step</w:t>
+      </w:r>
+      <w:r>
+        <w:t xml:space="preserve"> is </w:t>
+      </w:r>
+      <w:r>
+        <w:rPr>
+          <w:b/>
+        </w:rPr>
+        <w:t>free text, set when the job is posted</w:t>
+      </w:r>
+      <w:r>
+        <w:t xml:space="preserve"> (decided upfront). The email reads it verbatim; the app never generates it.</w:t>
+      </w:r>
+    </w:p>
+    <w:p>
+      <w:pPr>
+        <w:pStyle w:val="Heading2"/>
+      </w:pPr>
+      <w:r>
+        <w:t>Collection: `match_events` (audit of what was emailed)</w:t>
+      </w:r>
+    </w:p>
+    <w:p>
+      <w:r>
+        <w:rPr>
+          <w:rFonts w:ascii="Consolas" w:hAnsi="Consolas"/>
+          <w:sz w:val="18"/>
+        </w:rPr>
+        <w:t>{</w:t>
+        <w:br/>
+        <w:t xml:space="preserve">  "_id": "ObjectId",</w:t>
+        <w:br/>
+        <w:t xml:space="preserve">  "candidate_email": "student@example.com",</w:t>
+        <w:br/>
+        <w:t xml:space="preserve">  "listing_id": "ObjectId of matched listing",</w:t>
+        <w:br/>
+        <w:t xml:space="preserve">  "job_title": "Backend Engineering Intern",</w:t>
+        <w:br/>
+        <w:t xml:space="preserve">  "company": "Acme Fintech",</w:t>
+        <w:br/>
+        <w:t xml:space="preserve">  "score": 0.87,</w:t>
+        <w:br/>
+        <w:t xml:space="preserve">  "next_step": "Recruiter will schedule a 30-minute Zoom intro call.",</w:t>
+        <w:br/>
+        <w:t xml:space="preserve">  "emailed": true,</w:t>
+        <w:br/>
+        <w:t xml:space="preserve">  "created_at": "2026-10-03T10:05:00Z"</w:t>
         <w:br/>
         <w:t>}</w:t>
       </w:r>
@@ -583,17 +916,7 @@
         <w:br/>
         <w:t xml:space="preserve">  "fields": [</w:t>
         <w:br/>
-        <w:t xml:space="preserve">    {</w:t>
-        <w:br/>
-        <w:t xml:space="preserve">      "type": "vector",</w:t>
-        <w:br/>
-        <w:t xml:space="preserve">      "path": "embedding",</w:t>
-        <w:br/>
-        <w:t xml:space="preserve">      "numDimensions": 1024,</w:t>
-        <w:br/>
-        <w:t xml:space="preserve">      "similarity": "cosine"</w:t>
-        <w:br/>
-        <w:t xml:space="preserve">    }</w:t>
+        <w:t xml:space="preserve">    { "type": "vector", "path": "embedding", "numDimensions": 1024, "similarity": "cosine" }</w:t>
         <w:br/>
         <w:t xml:space="preserve">  ]</w:t>
         <w:br/>
@@ -610,7 +933,7 @@
     </w:p>
     <w:tbl>
       <w:tblPr>
-        <w:tblStyle w:val="LightGrid-Accent1"/>
+        <w:tblStyle w:val="TableGrid"/>
         <w:tblW w:type="auto" w:w="0"/>
         <w:tblLook w:firstColumn="1" w:firstRow="1" w:lastColumn="0" w:lastRow="0" w:noHBand="0" w:noVBand="1" w:val="04A0"/>
       </w:tblPr>
@@ -626,6 +949,14 @@
           </w:tcPr>
           <w:p>
             <w:r>
+              <w:rPr>
+                <w:b/>
+              </w:rPr>
+            </w:r>
+            <w:r>
+              <w:rPr>
+                <w:b/>
+              </w:rPr>
               <w:t>Method</w:t>
             </w:r>
           </w:p>
@@ -636,6 +967,14 @@
           </w:tcPr>
           <w:p>
             <w:r>
+              <w:rPr>
+                <w:b/>
+              </w:rPr>
+            </w:r>
+            <w:r>
+              <w:rPr>
+                <w:b/>
+              </w:rPr>
               <w:t>Endpoint</w:t>
             </w:r>
           </w:p>
@@ -646,6 +985,14 @@
           </w:tcPr>
           <w:p>
             <w:r>
+              <w:rPr>
+                <w:b/>
+              </w:rPr>
+            </w:r>
+            <w:r>
+              <w:rPr>
+                <w:b/>
+              </w:rPr>
               <w:t>Purpose</w:t>
             </w:r>
           </w:p>
@@ -657,7 +1004,12 @@
             <w:tcW w:type="dxa" w:w="2880"/>
           </w:tcPr>
           <w:p>
+            <w:r/>
             <w:r>
+              <w:rPr>
+                <w:rFonts w:ascii="Consolas" w:hAnsi="Consolas"/>
+                <w:color w:val="C7254E"/>
+              </w:rPr>
               <w:t>POST</w:t>
             </w:r>
           </w:p>
@@ -667,8 +1019,13 @@
             <w:tcW w:type="dxa" w:w="2880"/>
           </w:tcPr>
           <w:p>
+            <w:r/>
             <w:r>
-              <w:t>/api/search</w:t>
+              <w:rPr>
+                <w:rFonts w:ascii="Consolas" w:hAnsi="Consolas"/>
+                <w:color w:val="C7254E"/>
+              </w:rPr>
+              <w:t>/api/upload-cv</w:t>
             </w:r>
           </w:p>
         </w:tc>
@@ -677,8 +1034,19 @@
             <w:tcW w:type="dxa" w:w="2880"/>
           </w:tcPr>
           <w:p>
+            <w:r/>
             <w:r>
-              <w:t>Body: { "query_text": "..." } → ranked listings + match reasons</w:t>
+              <w:t xml:space="preserve">multipart: CV file + </w:t>
+            </w:r>
+            <w:r>
+              <w:rPr>
+                <w:rFonts w:ascii="Consolas" w:hAnsi="Consolas"/>
+                <w:color w:val="C7254E"/>
+              </w:rPr>
+              <w:t>email</w:t>
+            </w:r>
+            <w:r>
+              <w:t>. Parses, matches, emails all strong matches, returns summary.</w:t>
             </w:r>
           </w:p>
         </w:tc>
@@ -689,71 +1057,12 @@
             <w:tcW w:type="dxa" w:w="2880"/>
           </w:tcPr>
           <w:p>
+            <w:r/>
             <w:r>
-              <w:t>POST</w:t>
-            </w:r>
-          </w:p>
-        </w:tc>
-        <w:tc>
-          <w:tcPr>
-            <w:tcW w:type="dxa" w:w="2880"/>
-          </w:tcPr>
-          <w:p>
-            <w:r>
-              <w:t>/api/analyze-repo</w:t>
-            </w:r>
-          </w:p>
-        </w:tc>
-        <w:tc>
-          <w:tcPr>
-            <w:tcW w:type="dxa" w:w="2880"/>
-          </w:tcPr>
-          <w:p>
-            <w:r>
-              <w:t>Body: { "github_url": "..." } → generated profile text</w:t>
-            </w:r>
-          </w:p>
-        </w:tc>
-      </w:tr>
-      <w:tr>
-        <w:tc>
-          <w:tcPr>
-            <w:tcW w:type="dxa" w:w="2880"/>
-          </w:tcPr>
-          <w:p>
-            <w:r>
-              <w:t>POST</w:t>
-            </w:r>
-          </w:p>
-        </w:tc>
-        <w:tc>
-          <w:tcPr>
-            <w:tcW w:type="dxa" w:w="2880"/>
-          </w:tcPr>
-          <w:p>
-            <w:r>
-              <w:t>/api/match-from-repo</w:t>
-            </w:r>
-          </w:p>
-        </w:tc>
-        <w:tc>
-          <w:tcPr>
-            <w:tcW w:type="dxa" w:w="2880"/>
-          </w:tcPr>
-          <w:p>
-            <w:r>
-              <w:t>Combines analyze-repo + search in one call (demo button)</w:t>
-            </w:r>
-          </w:p>
-        </w:tc>
-      </w:tr>
-      <w:tr>
-        <w:tc>
-          <w:tcPr>
-            <w:tcW w:type="dxa" w:w="2880"/>
-          </w:tcPr>
-          <w:p>
-            <w:r>
+              <w:rPr>
+                <w:rFonts w:ascii="Consolas" w:hAnsi="Consolas"/>
+                <w:color w:val="C7254E"/>
+              </w:rPr>
               <w:t>GET</w:t>
             </w:r>
           </w:p>
@@ -763,7 +1072,12 @@
             <w:tcW w:type="dxa" w:w="2880"/>
           </w:tcPr>
           <w:p>
+            <w:r/>
             <w:r>
+              <w:rPr>
+                <w:rFonts w:ascii="Consolas" w:hAnsi="Consolas"/>
+                <w:color w:val="C7254E"/>
+              </w:rPr>
               <w:t>/api/health</w:t>
             </w:r>
           </w:p>
@@ -773,22 +1087,22 @@
             <w:tcW w:type="dxa" w:w="2880"/>
           </w:tcPr>
           <w:p>
+            <w:r/>
             <w:r>
-              <w:t>Health check</w:t>
+              <w:t>Health check.</w:t>
             </w:r>
           </w:p>
         </w:tc>
       </w:tr>
     </w:tbl>
+    <w:p/>
     <w:p>
-      <w:r/>
       <w:r>
         <w:rPr>
           <w:b/>
         </w:rPr>
-        <w:t>`/api/search` response:</w:t>
+        <w:t>`/api/upload-cv` response:</w:t>
       </w:r>
-      <w:r/>
     </w:p>
     <w:p>
       <w:r>
@@ -798,23 +1112,29 @@
         </w:rPr>
         <w:t>{</w:t>
         <w:br/>
-        <w:t xml:space="preserve">  "results": [</w:t>
+        <w:t xml:space="preserve">  "candidate_email": "student@example.com",</w:t>
+        <w:br/>
+        <w:t xml:space="preserve">  "matches": [</w:t>
         <w:br/>
         <w:t xml:space="preserve">    {</w:t>
         <w:br/>
-        <w:t xml:space="preserve">      "title": "Backend Engineering Intern",</w:t>
+        <w:t xml:space="preserve">      "job_title": "Backend Engineering Intern",</w:t>
         <w:br/>
         <w:t xml:space="preserve">      "company": "Acme Fintech",</w:t>
         <w:br/>
         <w:t xml:space="preserve">      "score": 0.87,</w:t>
         <w:br/>
-        <w:t xml:space="preserve">      "url": "https://...",</w:t>
+        <w:t xml:space="preserve">      "match_reason": "Your Postgres + API project maps to this SQL-heavy backend role.",</w:t>
         <w:br/>
-        <w:t xml:space="preserve">      "match_reason": "Your Postgres + API project maps to this SQL-heavy backend role."</w:t>
+        <w:t xml:space="preserve">      "next_step": "Recruiter will schedule a 30-minute Zoom intro call.",</w:t>
+        <w:br/>
+        <w:t xml:space="preserve">      "emailed": true</w:t>
         <w:br/>
         <w:t xml:space="preserve">    }</w:t>
         <w:br/>
-        <w:t xml:space="preserve">  ]</w:t>
+        <w:t xml:space="preserve">  ],</w:t>
+        <w:br/>
+        <w:t xml:space="preserve">  "total_emailed": 3</w:t>
         <w:br/>
         <w:t>}</w:t>
       </w:r>
@@ -824,44 +1144,132 @@
         <w:pStyle w:val="Heading1"/>
       </w:pPr>
       <w:r>
-        <w:t>7. The Agent (Flow B) — GitHub Repo Analysis</w:t>
+        <w:t>7. Matching Logic</w:t>
       </w:r>
     </w:p>
     <w:p>
+      <w:pPr>
+        <w:pStyle w:val="ListBullet"/>
+      </w:pPr>
       <w:r>
-        <w:t>1. Parse owner/repo from URL.</w:t>
+        <w:t>Embed full CV text as a single query vector (</w:t>
+      </w:r>
+      <w:r>
+        <w:rPr>
+          <w:rFonts w:ascii="Consolas" w:hAnsi="Consolas"/>
+          <w:color w:val="C7254E"/>
+        </w:rPr>
+        <w:t>input_type="query"</w:t>
+      </w:r>
+      <w:r>
+        <w:t>).</w:t>
       </w:r>
     </w:p>
     <w:p>
+      <w:pPr>
+        <w:pStyle w:val="ListBullet"/>
+      </w:pPr>
       <w:r>
-        <w:t>2. GitHub API: fetch README, repo tree, languages, and up to ~5 largest/most-relevant source files.</w:t>
+        <w:rPr>
+          <w:rFonts w:ascii="Consolas" w:hAnsi="Consolas"/>
+          <w:color w:val="C7254E"/>
+        </w:rPr>
+        <w:t>$vectorSearch</w:t>
+      </w:r>
+      <w:r>
+        <w:t xml:space="preserve"> with </w:t>
+      </w:r>
+      <w:r>
+        <w:rPr>
+          <w:rFonts w:ascii="Consolas" w:hAnsi="Consolas"/>
+          <w:color w:val="C7254E"/>
+        </w:rPr>
+        <w:t>numCandidates=100</w:t>
+      </w:r>
+      <w:r>
+        <w:t xml:space="preserve">, </w:t>
+      </w:r>
+      <w:r>
+        <w:rPr>
+          <w:rFonts w:ascii="Consolas" w:hAnsi="Consolas"/>
+          <w:color w:val="C7254E"/>
+        </w:rPr>
+        <w:t>limit=15</w:t>
+      </w:r>
+      <w:r>
+        <w:t xml:space="preserve">, project </w:t>
+      </w:r>
+      <w:r>
+        <w:rPr>
+          <w:rFonts w:ascii="Consolas" w:hAnsi="Consolas"/>
+          <w:color w:val="C7254E"/>
+        </w:rPr>
+        <w:t>vectorSearchScore</w:t>
+      </w:r>
+      <w:r>
+        <w:t>.</w:t>
       </w:r>
     </w:p>
     <w:p>
+      <w:pPr>
+        <w:pStyle w:val="ListBullet"/>
+      </w:pPr>
       <w:r>
-        <w:t>3. Build a prompt to Claude: *"Here is a student's repo. Produce a profile: top skills, demonstrated strengths, and 3 role types they'd fit."*</w:t>
+        <w:t xml:space="preserve">Keep matches where </w:t>
       </w:r>
-    </w:p>
-    <w:p>
       <w:r>
-        <w:t>4. Claude returns structured JSON (enforced via tool/schema).</w:t>
+        <w:rPr>
+          <w:rFonts w:ascii="Consolas" w:hAnsi="Consolas"/>
+          <w:color w:val="C7254E"/>
+        </w:rPr>
+        <w:t>score &gt;= MATCH_THRESHOLD</w:t>
       </w:r>
-    </w:p>
-    <w:p>
       <w:r>
-        <w:t>5. Concatenate into a rich query_text and run Flow A.</w:t>
+        <w:t xml:space="preserve"> (default </w:t>
       </w:r>
-    </w:p>
-    <w:p>
-      <w:r/>
       <w:r>
         <w:rPr>
           <w:b/>
         </w:rPr>
-        <w:t>Why it wins the demo:</w:t>
+        <w:t>0.75</w:t>
       </w:r>
       <w:r>
-        <w:t xml:space="preserve"> judges see raw code → autonomous analysis → relevant jobs, with no manual CV writing.</w:t>
+        <w:t>, tune during the demo).</w:t>
+      </w:r>
+    </w:p>
+    <w:p>
+      <w:pPr>
+        <w:pStyle w:val="ListBullet"/>
+      </w:pPr>
+      <w:r>
+        <w:t xml:space="preserve">Cap at </w:t>
+      </w:r>
+      <w:r>
+        <w:rPr>
+          <w:rFonts w:ascii="Consolas" w:hAnsi="Consolas"/>
+          <w:color w:val="C7254E"/>
+        </w:rPr>
+        <w:t>MAX_EMAILS</w:t>
+      </w:r>
+      <w:r>
+        <w:t xml:space="preserve"> (e.g. 5) to avoid spamming during a demo.</w:t>
+      </w:r>
+    </w:p>
+    <w:p>
+      <w:pPr>
+        <w:pStyle w:val="ListBullet"/>
+      </w:pPr>
+      <w:r>
+        <w:t xml:space="preserve">If </w:t>
+      </w:r>
+      <w:r>
+        <w:rPr>
+          <w:b/>
+        </w:rPr>
+        <w:t>zero</w:t>
+      </w:r>
+      <w:r>
+        <w:t xml:space="preserve"> matches clear the threshold, return the top 1 anyway, flagged "best available".</w:t>
       </w:r>
     </w:p>
     <w:p>
@@ -869,26 +1277,136 @@
         <w:pStyle w:val="Heading1"/>
       </w:pPr>
       <w:r>
-        <w:t>8. Demo Script (the money shot)</w:t>
+        <w:t>8. Email</w:t>
       </w:r>
     </w:p>
     <w:p>
+      <w:pPr>
+        <w:pStyle w:val="ListBullet"/>
+      </w:pPr>
       <w:r>
-        <w:t xml:space="preserve">1. Show a student's </w:t>
+        <w:t>For each strong match, send one email via Gmail SMTP:</w:t>
+      </w:r>
+    </w:p>
+    <w:p>
+      <w:pPr>
+        <w:pStyle w:val="ListBullet"/>
+      </w:pPr>
+      <w:r>
+        <w:t xml:space="preserve">Subject: </w:t>
+      </w:r>
+      <w:r>
+        <w:rPr>
+          <w:rFonts w:ascii="Consolas" w:hAnsi="Consolas"/>
+          <w:color w:val="C7254E"/>
+        </w:rPr>
+        <w:t>You matched: {job_title} at {company}</w:t>
+      </w:r>
+    </w:p>
+    <w:p>
+      <w:pPr>
+        <w:pStyle w:val="ListBullet"/>
+      </w:pPr>
+      <w:r>
+        <w:t xml:space="preserve">Body: a short match note (optionally the one-line </w:t>
+      </w:r>
+      <w:r>
+        <w:rPr>
+          <w:rFonts w:ascii="Consolas" w:hAnsi="Consolas"/>
+          <w:color w:val="C7254E"/>
+        </w:rPr>
+        <w:t>match_reason</w:t>
+      </w:r>
+      <w:r>
+        <w:t xml:space="preserve">) + </w:t>
       </w:r>
       <w:r>
         <w:rPr>
           <w:b/>
         </w:rPr>
-        <w:t>messy</w:t>
+        <w:t>"Next step: {next_step}"</w:t>
       </w:r>
       <w:r>
-        <w:t xml:space="preserve"> project description ("i made a thing that stores users and shows charts").</w:t>
+        <w:t xml:space="preserve"> pulled straight from the job's </w:t>
+      </w:r>
+      <w:r>
+        <w:rPr>
+          <w:rFonts w:ascii="Consolas" w:hAnsi="Consolas"/>
+          <w:color w:val="C7254E"/>
+        </w:rPr>
+        <w:t>next_step</w:t>
+      </w:r>
+      <w:r>
+        <w:t xml:space="preserve"> field + a link to the job </w:t>
+      </w:r>
+      <w:r>
+        <w:rPr>
+          <w:rFonts w:ascii="Consolas" w:hAnsi="Consolas"/>
+          <w:color w:val="C7254E"/>
+        </w:rPr>
+        <w:t>url</w:t>
+      </w:r>
+      <w:r>
+        <w:t>.</w:t>
       </w:r>
     </w:p>
     <w:p>
+      <w:pPr>
+        <w:pStyle w:val="ListBullet"/>
+      </w:pPr>
       <w:r>
-        <w:t xml:space="preserve">2. Paste it in → show perfectly matched, </w:t>
+        <w:t xml:space="preserve">Record each send in </w:t>
+      </w:r>
+      <w:r>
+        <w:rPr>
+          <w:rFonts w:ascii="Consolas" w:hAnsi="Consolas"/>
+          <w:color w:val="C7254E"/>
+        </w:rPr>
+        <w:t>match_events</w:t>
+      </w:r>
+      <w:r>
+        <w:t>.</w:t>
+      </w:r>
+    </w:p>
+    <w:p>
+      <w:pPr>
+        <w:pStyle w:val="ListBullet"/>
+      </w:pPr>
+      <w:r>
+        <w:t>The recruiter then runs that next step — outside the app.</w:t>
+      </w:r>
+    </w:p>
+    <w:p>
+      <w:pPr>
+        <w:pStyle w:val="Heading1"/>
+      </w:pPr>
+      <w:r>
+        <w:t>9. Demo Script (the money shot)</w:t>
+      </w:r>
+    </w:p>
+    <w:p>
+      <w:pPr>
+        <w:pStyle w:val="ListNumber"/>
+      </w:pPr>
+      <w:r>
+        <w:t>Upload a sample CV (messy, project-heavy) + enter a demo email.</w:t>
+      </w:r>
+    </w:p>
+    <w:p>
+      <w:pPr>
+        <w:pStyle w:val="ListNumber"/>
+      </w:pPr>
+      <w:r>
+        <w:t xml:space="preserve">App shows </w:t>
+      </w:r>
+      <w:r>
+        <w:rPr>
+          <w:b/>
+        </w:rPr>
+        <w:t>multiple</w:t>
+      </w:r>
+      <w:r>
+        <w:t xml:space="preserve"> strong matches ranked by score — including a </w:t>
       </w:r>
       <w:r>
         <w:rPr>
@@ -897,31 +1415,49 @@
         <w:t>non-obvious</w:t>
       </w:r>
       <w:r>
-        <w:t xml:space="preserve"> results (backend role matched via DB skills).</w:t>
+        <w:t xml:space="preserve"> one (backend role matched via DB skills in the CV).</w:t>
       </w:r>
     </w:p>
     <w:p>
+      <w:pPr>
+        <w:pStyle w:val="ListNumber"/>
+      </w:pPr>
       <w:r>
-        <w:t xml:space="preserve">3. Hit </w:t>
+        <w:t xml:space="preserve">Switch to the inbox → show the </w:t>
       </w:r>
       <w:r>
         <w:rPr>
           <w:b/>
         </w:rPr>
-        <w:t>"Analyze my GitHub"</w:t>
+        <w:t>emails that arrived</w:t>
       </w:r>
       <w:r>
-        <w:t xml:space="preserve"> → paste a repo URL.</w:t>
+        <w:t>, one per matched job.</w:t>
       </w:r>
     </w:p>
     <w:p>
+      <w:pPr>
+        <w:pStyle w:val="ListNumber"/>
+      </w:pPr>
       <w:r>
-        <w:t>4. Watch the agent summarize the repo live, then auto-run the search.</w:t>
+        <w:t xml:space="preserve">Open one email → point out it names the role </w:t>
+      </w:r>
+      <w:r>
+        <w:rPr>
+          <w:b/>
+        </w:rPr>
+        <w:t>and the predefined next step</w:t>
+      </w:r>
+      <w:r>
+        <w:t xml:space="preserve"> (e.g. "Recruiter will schedule a Zoom call").</w:t>
       </w:r>
     </w:p>
     <w:p>
+      <w:pPr>
+        <w:pStyle w:val="ListNumber"/>
+      </w:pPr>
       <w:r>
-        <w:t>5. Highlight the "why this matched" explanations — this is the semantic magic.</w:t>
+        <w:t>Frame it: the app automated discovery → semantic match → outreach, and the recruiter's next step was decided upfront per job.</w:t>
       </w:r>
     </w:p>
     <w:p>
@@ -929,12 +1465,12 @@
         <w:pStyle w:val="Heading1"/>
       </w:pPr>
       <w:r>
-        <w:t>9. Team Split (4 people, ~build order)</w:t>
+        <w:t>10. Team Split (4 people)</w:t>
       </w:r>
     </w:p>
     <w:tbl>
       <w:tblPr>
-        <w:tblStyle w:val="LightGrid-Accent1"/>
+        <w:tblStyle w:val="TableGrid"/>
         <w:tblW w:type="auto" w:w="0"/>
         <w:tblLook w:firstColumn="1" w:firstRow="1" w:lastColumn="0" w:lastRow="0" w:noHBand="0" w:noVBand="1" w:val="04A0"/>
       </w:tblPr>
@@ -949,6 +1485,14 @@
           </w:tcPr>
           <w:p>
             <w:r>
+              <w:rPr>
+                <w:b/>
+              </w:rPr>
+            </w:r>
+            <w:r>
+              <w:rPr>
+                <w:b/>
+              </w:rPr>
               <w:t>Person</w:t>
             </w:r>
           </w:p>
@@ -959,6 +1503,14 @@
           </w:tcPr>
           <w:p>
             <w:r>
+              <w:rPr>
+                <w:b/>
+              </w:rPr>
+            </w:r>
+            <w:r>
+              <w:rPr>
+                <w:b/>
+              </w:rPr>
               <w:t>Owns</w:t>
             </w:r>
           </w:p>
@@ -970,8 +1522,12 @@
             <w:tcW w:type="dxa" w:w="4320"/>
           </w:tcPr>
           <w:p>
+            <w:r/>
             <w:r>
-              <w:t>P1 — Data/Backend</w:t>
+              <w:rPr>
+                <w:b/>
+              </w:rPr>
+              <w:t>P1 — Data</w:t>
             </w:r>
           </w:p>
         </w:tc>
@@ -980,8 +1536,19 @@
             <w:tcW w:type="dxa" w:w="4320"/>
           </w:tcPr>
           <w:p>
+            <w:r/>
             <w:r>
-              <w:t>Scraping/ingest script, MongoDB schema, Voyage embedding pipeline, Atlas index</w:t>
+              <w:t xml:space="preserve">Author ~300 sample job descriptions (incl. </w:t>
+            </w:r>
+            <w:r>
+              <w:rPr>
+                <w:rFonts w:ascii="Consolas" w:hAnsi="Consolas"/>
+                <w:color w:val="C7254E"/>
+              </w:rPr>
+              <w:t>next_step</w:t>
+            </w:r>
+            <w:r>
+              <w:t>) as a committed dataset, MongoDB schema, Voyage pipeline, Atlas index</w:t>
             </w:r>
           </w:p>
         </w:tc>
@@ -992,8 +1559,12 @@
             <w:tcW w:type="dxa" w:w="4320"/>
           </w:tcPr>
           <w:p>
+            <w:r/>
             <w:r>
-              <w:t>P2 — Backend/API</w:t>
+              <w:rPr>
+                <w:b/>
+              </w:rPr>
+              <w:t>P2 — Backend/Match</w:t>
             </w:r>
           </w:p>
         </w:tc>
@@ -1002,8 +1573,26 @@
             <w:tcW w:type="dxa" w:w="4320"/>
           </w:tcPr>
           <w:p>
+            <w:r/>
             <w:r>
-              <w:t>FastAPI endpoints, $vectorSearch query, match-reason generation</w:t>
+              <w:t xml:space="preserve">FastAPI, CV parsing, </w:t>
+            </w:r>
+            <w:r>
+              <w:rPr>
+                <w:rFonts w:ascii="Consolas" w:hAnsi="Consolas"/>
+                <w:color w:val="C7254E"/>
+              </w:rPr>
+              <w:t>$vectorSearch</w:t>
+            </w:r>
+            <w:r>
+              <w:t xml:space="preserve">, threshold logic, </w:t>
+            </w:r>
+            <w:r>
+              <w:rPr>
+                <w:rFonts w:ascii="Consolas" w:hAnsi="Consolas"/>
+                <w:color w:val="C7254E"/>
+              </w:rPr>
+              <w:t>match_events</w:t>
             </w:r>
           </w:p>
         </w:tc>
@@ -1014,8 +1603,12 @@
             <w:tcW w:type="dxa" w:w="4320"/>
           </w:tcPr>
           <w:p>
+            <w:r/>
             <w:r>
-              <w:t>P3 — Agent</w:t>
+              <w:rPr>
+                <w:b/>
+              </w:rPr>
+              <w:t>P3 — Email</w:t>
             </w:r>
           </w:p>
         </w:tc>
@@ -1024,8 +1617,9 @@
             <w:tcW w:type="dxa" w:w="4320"/>
           </w:tcPr>
           <w:p>
+            <w:r/>
             <w:r>
-              <w:t>GitHub fetch + Claude repo-analysis agent, structured output</w:t>
+              <w:t>Gmail SMTP sender, one-email-per-match, optional Claude match reasons</w:t>
             </w:r>
           </w:p>
         </w:tc>
@@ -1036,7 +1630,11 @@
             <w:tcW w:type="dxa" w:w="4320"/>
           </w:tcPr>
           <w:p>
+            <w:r/>
             <w:r>
+              <w:rPr>
+                <w:b/>
+              </w:rPr>
               <w:t>P4 — Frontend</w:t>
             </w:r>
           </w:p>
@@ -1046,24 +1644,26 @@
             <w:tcW w:type="dxa" w:w="4320"/>
           </w:tcPr>
           <w:p>
+            <w:r/>
             <w:r>
-              <w:t>React UI, search box, results cards, repo-analyze flow, demo polish</w:t>
+              <w:t>React UI: CV upload + email field, matches view, demo polish</w:t>
             </w:r>
           </w:p>
         </w:tc>
       </w:tr>
     </w:tbl>
+    <w:p/>
     <w:p>
       <w:pPr>
         <w:pStyle w:val="Heading1"/>
       </w:pPr>
       <w:r>
-        <w:t>10. Risks &amp; Mitigations</w:t>
+        <w:t>11. Risks &amp; Mitigations</w:t>
       </w:r>
     </w:p>
     <w:tbl>
       <w:tblPr>
-        <w:tblStyle w:val="LightGrid-Accent1"/>
+        <w:tblStyle w:val="TableGrid"/>
         <w:tblW w:type="auto" w:w="0"/>
         <w:tblLook w:firstColumn="1" w:firstRow="1" w:lastColumn="0" w:lastRow="0" w:noHBand="0" w:noVBand="1" w:val="04A0"/>
       </w:tblPr>
@@ -1078,6 +1678,14 @@
           </w:tcPr>
           <w:p>
             <w:r>
+              <w:rPr>
+                <w:b/>
+              </w:rPr>
+            </w:r>
+            <w:r>
+              <w:rPr>
+                <w:b/>
+              </w:rPr>
               <w:t>Risk</w:t>
             </w:r>
           </w:p>
@@ -1088,6 +1696,14 @@
           </w:tcPr>
           <w:p>
             <w:r>
+              <w:rPr>
+                <w:b/>
+              </w:rPr>
+            </w:r>
+            <w:r>
+              <w:rPr>
+                <w:b/>
+              </w:rPr>
               <w:t>Mitigation</w:t>
             </w:r>
           </w:p>
@@ -1099,8 +1715,9 @@
             <w:tcW w:type="dxa" w:w="4320"/>
           </w:tcPr>
           <w:p>
+            <w:r/>
             <w:r>
-              <w:t>Scraping blocked / slow</w:t>
+              <w:t>Scraping</w:t>
             </w:r>
           </w:p>
         </w:tc>
@@ -1109,8 +1726,15 @@
             <w:tcW w:type="dxa" w:w="4320"/>
           </w:tcPr>
           <w:p>
+            <w:r/>
             <w:r>
-              <w:t>Pre-save a JSON dump of ~300 listings; commit it to repo</w:t>
+              <w:rPr>
+                <w:b/>
+              </w:rPr>
+              <w:t>None</w:t>
+            </w:r>
+            <w:r>
+              <w:t xml:space="preserve"> — out of scope; listings are pre-seeded data</w:t>
             </w:r>
           </w:p>
         </w:tc>
@@ -1121,8 +1745,9 @@
             <w:tcW w:type="dxa" w:w="4320"/>
           </w:tcPr>
           <w:p>
+            <w:r/>
             <w:r>
-              <w:t>Voyage/Claude API limits during demo</w:t>
+              <w:t>Gmail SMTP app-password issues</w:t>
             </w:r>
           </w:p>
         </w:tc>
@@ -1131,8 +1756,9 @@
             <w:tcW w:type="dxa" w:w="4320"/>
           </w:tcPr>
           <w:p>
+            <w:r/>
             <w:r>
-              <w:t>Cache embeddings in DB; pre-run the demo repo once</w:t>
+              <w:t>Set up + test the app password on day 1; have a mock-send fallback that logs the email</w:t>
             </w:r>
           </w:p>
         </w:tc>
@@ -1143,8 +1769,9 @@
             <w:tcW w:type="dxa" w:w="4320"/>
           </w:tcPr>
           <w:p>
+            <w:r/>
             <w:r>
-              <w:t>Vector index not ready</w:t>
+              <w:t>Emails land in spam</w:t>
             </w:r>
           </w:p>
         </w:tc>
@@ -1153,8 +1780,9 @@
             <w:tcW w:type="dxa" w:w="4320"/>
           </w:tcPr>
           <w:p>
+            <w:r/>
             <w:r>
-              <w:t>Create index early (step 1); it takes minutes to build</w:t>
+              <w:t>Use a real test inbox you control; pre-send once before the demo</w:t>
             </w:r>
           </w:p>
         </w:tc>
@@ -1165,6 +1793,41 @@
             <w:tcW w:type="dxa" w:w="4320"/>
           </w:tcPr>
           <w:p>
+            <w:r/>
+            <w:r>
+              <w:t>Threshold too strict/loose</w:t>
+            </w:r>
+          </w:p>
+        </w:tc>
+        <w:tc>
+          <w:tcPr>
+            <w:tcW w:type="dxa" w:w="4320"/>
+          </w:tcPr>
+          <w:p>
+            <w:r/>
+            <w:r>
+              <w:t xml:space="preserve">Make </w:t>
+            </w:r>
+            <w:r>
+              <w:rPr>
+                <w:rFonts w:ascii="Consolas" w:hAnsi="Consolas"/>
+                <w:color w:val="C7254E"/>
+              </w:rPr>
+              <w:t>MATCH_THRESHOLD</w:t>
+            </w:r>
+            <w:r>
+              <w:t xml:space="preserve"> an env var; tune live</w:t>
+            </w:r>
+          </w:p>
+        </w:tc>
+      </w:tr>
+      <w:tr>
+        <w:tc>
+          <w:tcPr>
+            <w:tcW w:type="dxa" w:w="4320"/>
+          </w:tcPr>
+          <w:p>
+            <w:r/>
             <w:r>
               <w:t>Dimension mismatch</w:t>
             </w:r>
@@ -1175,8 +1838,19 @@
             <w:tcW w:type="dxa" w:w="4320"/>
           </w:tcPr>
           <w:p>
+            <w:r/>
             <w:r>
-              <w:t>Lock voyage-3 = 1024 dims everywhere</w:t>
+              <w:t xml:space="preserve">Lock </w:t>
+            </w:r>
+            <w:r>
+              <w:rPr>
+                <w:rFonts w:ascii="Consolas" w:hAnsi="Consolas"/>
+                <w:color w:val="C7254E"/>
+              </w:rPr>
+              <w:t>voyage-3</w:t>
+            </w:r>
+            <w:r>
+              <w:t xml:space="preserve"> = 1024 dims everywhere</w:t>
             </w:r>
           </w:p>
         </w:tc>
@@ -1187,8 +1861,9 @@
             <w:tcW w:type="dxa" w:w="4320"/>
           </w:tcPr>
           <w:p>
+            <w:r/>
             <w:r>
-              <w:t>Time crunch</w:t>
+              <w:t>Demo spam</w:t>
             </w:r>
           </w:p>
         </w:tc>
@@ -1197,19 +1872,31 @@
             <w:tcW w:type="dxa" w:w="4320"/>
           </w:tcPr>
           <w:p>
+            <w:r/>
             <w:r>
-              <w:t>Flow A is the MVP; Flow B (agent) is the "wow" add-on</w:t>
+              <w:t xml:space="preserve">Cap </w:t>
+            </w:r>
+            <w:r>
+              <w:rPr>
+                <w:rFonts w:ascii="Consolas" w:hAnsi="Consolas"/>
+                <w:color w:val="C7254E"/>
+              </w:rPr>
+              <w:t>MAX_EMAILS</w:t>
+            </w:r>
+            <w:r>
+              <w:t xml:space="preserve"> per upload (e.g. 5)</w:t>
             </w:r>
           </w:p>
         </w:tc>
       </w:tr>
     </w:tbl>
+    <w:p/>
     <w:p>
       <w:pPr>
         <w:pStyle w:val="Heading1"/>
       </w:pPr>
       <w:r>
-        <w:t>11. Build Milestones</w:t>
+        <w:t>12. Build Milestones</w:t>
       </w:r>
     </w:p>
     <w:p>
@@ -1217,7 +1904,33 @@
         <w:pStyle w:val="ListBullet"/>
       </w:pPr>
       <w:r>
-        <w:t>M1 (first 2h): Atlas cluster up, index created, 50 listings ingested with embeddings.</w:t>
+        <w:rPr>
+          <w:b/>
+        </w:rPr>
+        <w:t>M1 (first 2h):</w:t>
+      </w:r>
+      <w:r>
+        <w:t xml:space="preserve"> Atlas up, </w:t>
+      </w:r>
+      <w:r>
+        <w:rPr>
+          <w:rFonts w:ascii="Consolas" w:hAnsi="Consolas"/>
+          <w:color w:val="C7254E"/>
+        </w:rPr>
+        <w:t>vector_index</w:t>
+      </w:r>
+      <w:r>
+        <w:t xml:space="preserve"> created, ~300 sample job descriptions seeded with embeddings + </w:t>
+      </w:r>
+      <w:r>
+        <w:rPr>
+          <w:rFonts w:ascii="Consolas" w:hAnsi="Consolas"/>
+          <w:color w:val="C7254E"/>
+        </w:rPr>
+        <w:t>next_step</w:t>
+      </w:r>
+      <w:r>
+        <w:t>.</w:t>
       </w:r>
     </w:p>
     <w:p>
@@ -1225,7 +1938,23 @@
         <w:pStyle w:val="ListBullet"/>
       </w:pPr>
       <w:r>
-        <w:t>M2: /api/search returns real ranked results via $vectorSearch.</w:t>
+        <w:rPr>
+          <w:b/>
+        </w:rPr>
+        <w:t>M2:</w:t>
+      </w:r>
+      <w:r>
+        <w:t xml:space="preserve"> </w:t>
+      </w:r>
+      <w:r>
+        <w:rPr>
+          <w:rFonts w:ascii="Consolas" w:hAnsi="Consolas"/>
+          <w:color w:val="C7254E"/>
+        </w:rPr>
+        <w:t>/api/upload-cv</w:t>
+      </w:r>
+      <w:r>
+        <w:t xml:space="preserve"> parses a CV and returns ranked matches (no email yet).</w:t>
       </w:r>
     </w:p>
     <w:p>
@@ -1233,7 +1962,23 @@
         <w:pStyle w:val="ListBullet"/>
       </w:pPr>
       <w:r>
-        <w:t>M3: React UI calls search, renders cards.</w:t>
+        <w:rPr>
+          <w:b/>
+        </w:rPr>
+        <w:t>M3:</w:t>
+      </w:r>
+      <w:r>
+        <w:t xml:space="preserve"> Threshold filtering + </w:t>
+      </w:r>
+      <w:r>
+        <w:rPr>
+          <w:rFonts w:ascii="Consolas" w:hAnsi="Consolas"/>
+          <w:color w:val="C7254E"/>
+        </w:rPr>
+        <w:t>match_events</w:t>
+      </w:r>
+      <w:r>
+        <w:t xml:space="preserve"> records.</w:t>
       </w:r>
     </w:p>
     <w:p>
@@ -1241,7 +1986,23 @@
         <w:pStyle w:val="ListBullet"/>
       </w:pPr>
       <w:r>
-        <w:t>M4: Agent (/api/analyze-repo) works on one real repo.</w:t>
+        <w:rPr>
+          <w:b/>
+        </w:rPr>
+        <w:t>M4:</w:t>
+      </w:r>
+      <w:r>
+        <w:t xml:space="preserve"> Gmail SMTP sends one email per match, stating </w:t>
+      </w:r>
+      <w:r>
+        <w:rPr>
+          <w:rFonts w:ascii="Consolas" w:hAnsi="Consolas"/>
+          <w:color w:val="C7254E"/>
+        </w:rPr>
+        <w:t>next_step</w:t>
+      </w:r>
+      <w:r>
+        <w:t>.</w:t>
       </w:r>
     </w:p>
     <w:p>
@@ -1249,7 +2010,13 @@
         <w:pStyle w:val="ListBullet"/>
       </w:pPr>
       <w:r>
-        <w:t>M5: Match reasons + demo polish + rehearse the script.</w:t>
+        <w:rPr>
+          <w:b/>
+        </w:rPr>
+        <w:t>M5:</w:t>
+      </w:r>
+      <w:r>
+        <w:t xml:space="preserve"> React upload UI + matches view + rehearse the demo twice.</w:t>
       </w:r>
     </w:p>
     <w:p>
@@ -1257,7 +2024,7 @@
         <w:pStyle w:val="Heading1"/>
       </w:pPr>
       <w:r>
-        <w:t>12. Environment Variables</w:t>
+        <w:t>13. Environment Variables</w:t>
       </w:r>
     </w:p>
     <w:p>
@@ -1266,13 +2033,21 @@
           <w:rFonts w:ascii="Consolas" w:hAnsi="Consolas"/>
           <w:sz w:val="18"/>
         </w:rPr>
+        <w:t># backend/.env</w:t>
+        <w:br/>
         <w:t>MONGODB_URI=mongodb+srv://...</w:t>
         <w:br/>
         <w:t>VOYAGE_API_KEY=...</w:t>
         <w:br/>
-        <w:t>ANTHROPIC_API_KEY=...</w:t>
+        <w:t>ANTHROPIC_API_KEY=...          # only if using match reasons</w:t>
         <w:br/>
-        <w:t>GITHUB_TOKEN=...        # optional, raises rate limit</w:t>
+        <w:t>MATCH_THRESHOLD=0.75</w:t>
+        <w:br/>
+        <w:t>MAX_EMAILS=5</w:t>
+        <w:br/>
+        <w:t>GMAIL_ADDRESS=youraddr@gmail.com</w:t>
+        <w:br/>
+        <w:t>GMAIL_APP_PASSWORD=xxxx xxxx xxxx xxxx</w:t>
       </w:r>
     </w:p>
     <w:sectPr>

</xml_diff>